<commit_message>
Add live GitHub setup walkthrough to install prompt Step 3
Founders without a GitHub account or the gh CLI previously hit a wall
at the first `git init` step. Install prompt Step 3 now runs an
explicit sub-flow when `git remote -v` returns no origin: checks for
an existing account, walks through signup via WebFetch, installs and
authenticates the gh CLI, creates the private repo with
`gh repo create --source=. --push`, and verifies the initial commit
landed. Manual fallback covered for founders who can't install gh.

README prerequisites re-framed so founders know they don't need to
prep GitHub themselves — the install handles it.
</commit_message>
<xml_diff>
--- a/gtm-master-playbook-bundle-combined.docx
+++ b/gtm-master-playbook-bundle-combined.docx
@@ -471,7 +471,7 @@
         <w:t xml:space="preserve">A GitHub account</w:t>
       </w:r>
       <w:r>
-        <w:t xml:space="preserve">. The operating system uses git for version control of every playbook, every brief, and every weekly review. Sign up at</w:t>
+        <w:t xml:space="preserve">. The operating system uses git for version control of every playbook, every brief, and every weekly review. If you don’t already have one, don’t prep anything — the install prompt detects the gap during Step 3, walks you through account signup, installs the GitHub CLI, authenticates you, creates the private repo for your brand, and pushes the initial commit. All live in the session. Sign up at</w:t>
       </w:r>
       <w:r>
         <w:t xml:space="preserve"> </w:t>
@@ -488,7 +488,7 @@
         <w:t xml:space="preserve"> </w:t>
       </w:r>
       <w:r>
-        <w:t xml:space="preserve">if you don’t have one.</w:t>
+        <w:t xml:space="preserve">yourself beforehand only if you prefer.</w:t>
       </w:r>
     </w:p>
     <w:p>
@@ -5790,7 +5790,7 @@
     </w:p>
     <w:bookmarkEnd w:id="57"/>
     <w:bookmarkEnd w:id="58"/>
-    <w:bookmarkStart w:id="83" w:name="ai-gtm-master-playbook-install-prompt"/>
+    <w:bookmarkStart w:id="84" w:name="ai-gtm-master-playbook-install-prompt"/>
     <w:p>
       <w:pPr>
         <w:pStyle w:val="Heading1"/>
@@ -6869,7 +6869,7 @@
     </w:p>
     <w:bookmarkEnd w:id="61"/>
     <w:bookmarkEnd w:id="62"/>
-    <w:bookmarkStart w:id="63" w:name="step-3.-project-directory-setup"/>
+    <w:bookmarkStart w:id="64" w:name="step-3.-project-directory-setup"/>
     <w:p>
       <w:pPr>
         <w:pStyle w:val="Heading2"/>
@@ -7035,6 +7035,480 @@
       </w:r>
       <w:r>
         <w:t xml:space="preserve">listed.</w:t>
+      </w:r>
+    </w:p>
+    <w:bookmarkStart w:id="63" w:name="connect-the-folder-to-a-github-remote"/>
+    <w:p>
+      <w:pPr>
+        <w:pStyle w:val="Heading3"/>
+      </w:pPr>
+      <w:r>
+        <w:t xml:space="preserve">Connect the folder to a GitHub remote</w:t>
+      </w:r>
+    </w:p>
+    <w:p>
+      <w:pPr>
+        <w:pStyle w:val="FirstParagraph"/>
+      </w:pPr>
+      <w:r>
+        <w:t xml:space="preserve">Run</w:t>
+      </w:r>
+      <w:r>
+        <w:t xml:space="preserve"> </w:t>
+      </w:r>
+      <w:r>
+        <w:rPr>
+          <w:rStyle w:val="VerbatimChar"/>
+        </w:rPr>
+        <w:t xml:space="preserve">git remote -v</w:t>
+      </w:r>
+      <w:r>
+        <w:t xml:space="preserve">. If an</w:t>
+      </w:r>
+      <w:r>
+        <w:t xml:space="preserve"> </w:t>
+      </w:r>
+      <w:r>
+        <w:rPr>
+          <w:rStyle w:val="VerbatimChar"/>
+        </w:rPr>
+        <w:t xml:space="preserve">origin</w:t>
+      </w:r>
+      <w:r>
+        <w:t xml:space="preserve"> </w:t>
+      </w:r>
+      <w:r>
+        <w:t xml:space="preserve">is already configured and points to GitHub, skip this sub-step and continue.</w:t>
+      </w:r>
+    </w:p>
+    <w:p>
+      <w:pPr>
+        <w:pStyle w:val="BodyText"/>
+      </w:pPr>
+      <w:r>
+        <w:t xml:space="preserve">If no remote is configured, walk the user through setting one up. GitHub is load-bearing for the operating system — every playbook, brief, and weekly review lives there. Do not skip.</w:t>
+      </w:r>
+    </w:p>
+    <w:p>
+      <w:pPr>
+        <w:numPr>
+          <w:ilvl w:val="0"/>
+          <w:numId w:val="1038"/>
+        </w:numPr>
+      </w:pPr>
+      <w:r>
+        <w:rPr>
+          <w:b/>
+          <w:bCs/>
+        </w:rPr>
+        <w:t xml:space="preserve">Check for an existing GitHub account.</w:t>
+      </w:r>
+      <w:r>
+        <w:t xml:space="preserve"> </w:t>
+      </w:r>
+      <w:r>
+        <w:t xml:space="preserve">Ask:</w:t>
+      </w:r>
+      <w:r>
+        <w:t xml:space="preserve"> </w:t>
+      </w:r>
+      <w:r>
+        <w:rPr>
+          <w:i/>
+          <w:iCs/>
+        </w:rPr>
+        <w:t xml:space="preserve">“Do you already have a GitHub account? (yes / no)”</w:t>
+      </w:r>
+    </w:p>
+    <w:p>
+      <w:pPr>
+        <w:numPr>
+          <w:ilvl w:val="0"/>
+          <w:numId w:val="1038"/>
+        </w:numPr>
+      </w:pPr>
+      <w:r>
+        <w:rPr>
+          <w:b/>
+          <w:bCs/>
+        </w:rPr>
+        <w:t xml:space="preserve">If</w:t>
+      </w:r>
+      <w:r>
+        <w:rPr>
+          <w:b/>
+          <w:bCs/>
+        </w:rPr>
+        <w:t xml:space="preserve"> </w:t>
+      </w:r>
+      <w:r>
+        <w:rPr>
+          <w:rStyle w:val="VerbatimChar"/>
+          <w:b/>
+          <w:bCs/>
+        </w:rPr>
+        <w:t xml:space="preserve">no</w:t>
+      </w:r>
+      <w:r>
+        <w:rPr>
+          <w:b/>
+          <w:bCs/>
+        </w:rPr>
+        <w:t xml:space="preserve">.</w:t>
+      </w:r>
+      <w:r>
+        <w:t xml:space="preserve"> </w:t>
+      </w:r>
+      <w:r>
+        <w:t xml:space="preserve">WebFetch the current GitHub signup page and walk the user through creating an account. Ask them to confirm their GitHub username once the account is active. Do not invent the signup URL or steps from memory — pull fresh from the web.</w:t>
+      </w:r>
+    </w:p>
+    <w:p>
+      <w:pPr>
+        <w:numPr>
+          <w:ilvl w:val="0"/>
+          <w:numId w:val="1038"/>
+        </w:numPr>
+      </w:pPr>
+      <w:r>
+        <w:rPr>
+          <w:b/>
+          <w:bCs/>
+        </w:rPr>
+        <w:t xml:space="preserve">Authenticate locally via the GitHub CLI.</w:t>
+      </w:r>
+      <w:r>
+        <w:t xml:space="preserve"> </w:t>
+      </w:r>
+      <w:r>
+        <w:t xml:space="preserve">Check whether</w:t>
+      </w:r>
+      <w:r>
+        <w:t xml:space="preserve"> </w:t>
+      </w:r>
+      <w:r>
+        <w:rPr>
+          <w:rStyle w:val="VerbatimChar"/>
+        </w:rPr>
+        <w:t xml:space="preserve">gh</w:t>
+      </w:r>
+      <w:r>
+        <w:t xml:space="preserve"> </w:t>
+      </w:r>
+      <w:r>
+        <w:t xml:space="preserve">is installed (</w:t>
+      </w:r>
+      <w:r>
+        <w:rPr>
+          <w:rStyle w:val="VerbatimChar"/>
+        </w:rPr>
+        <w:t xml:space="preserve">gh --version</w:t>
+      </w:r>
+      <w:r>
+        <w:t xml:space="preserve">). If not installed, WebFetch the current</w:t>
+      </w:r>
+      <w:r>
+        <w:t xml:space="preserve"> </w:t>
+      </w:r>
+      <w:r>
+        <w:rPr>
+          <w:rStyle w:val="VerbatimChar"/>
+        </w:rPr>
+        <w:t xml:space="preserve">gh</w:t>
+      </w:r>
+      <w:r>
+        <w:t xml:space="preserve"> </w:t>
+      </w:r>
+      <w:r>
+        <w:t xml:space="preserve">install instructions for the user’s OS (macOS:</w:t>
+      </w:r>
+      <w:r>
+        <w:t xml:space="preserve"> </w:t>
+      </w:r>
+      <w:r>
+        <w:rPr>
+          <w:rStyle w:val="VerbatimChar"/>
+        </w:rPr>
+        <w:t xml:space="preserve">brew install gh</w:t>
+      </w:r>
+      <w:r>
+        <w:t xml:space="preserve">; Windows: winget or installer; Linux: apt/yum) and walk them through installation. Then run</w:t>
+      </w:r>
+      <w:r>
+        <w:t xml:space="preserve"> </w:t>
+      </w:r>
+      <w:r>
+        <w:rPr>
+          <w:rStyle w:val="VerbatimChar"/>
+        </w:rPr>
+        <w:t xml:space="preserve">gh auth status</w:t>
+      </w:r>
+      <w:r>
+        <w:t xml:space="preserve">. If not authenticated, walk them through</w:t>
+      </w:r>
+      <w:r>
+        <w:t xml:space="preserve"> </w:t>
+      </w:r>
+      <w:r>
+        <w:rPr>
+          <w:rStyle w:val="VerbatimChar"/>
+        </w:rPr>
+        <w:t xml:space="preserve">gh auth login</w:t>
+      </w:r>
+      <w:r>
+        <w:t xml:space="preserve"> </w:t>
+      </w:r>
+      <w:r>
+        <w:t xml:space="preserve">(select GitHub.com, HTTPS, authenticate via web browser). Confirm</w:t>
+      </w:r>
+      <w:r>
+        <w:t xml:space="preserve"> </w:t>
+      </w:r>
+      <w:r>
+        <w:rPr>
+          <w:rStyle w:val="VerbatimChar"/>
+        </w:rPr>
+        <w:t xml:space="preserve">gh auth status</w:t>
+      </w:r>
+      <w:r>
+        <w:t xml:space="preserve"> </w:t>
+      </w:r>
+      <w:r>
+        <w:t xml:space="preserve">reports a logged-in user before proceeding.</w:t>
+      </w:r>
+    </w:p>
+    <w:p>
+      <w:pPr>
+        <w:numPr>
+          <w:ilvl w:val="0"/>
+          <w:numId w:val="1038"/>
+        </w:numPr>
+      </w:pPr>
+      <w:r>
+        <w:rPr>
+          <w:b/>
+          <w:bCs/>
+        </w:rPr>
+        <w:t xml:space="preserve">Create the remote repo and push the initial commit.</w:t>
+      </w:r>
+      <w:r>
+        <w:t xml:space="preserve"> </w:t>
+      </w:r>
+      <w:r>
+        <w:t xml:space="preserve">Run:</w:t>
+      </w:r>
+    </w:p>
+    <w:p>
+      <w:pPr>
+        <w:pStyle w:val="SourceCode"/>
+        <w:numPr>
+          <w:ilvl w:val="0"/>
+          <w:numId w:val="1000"/>
+        </w:numPr>
+      </w:pPr>
+      <w:r>
+        <w:rPr>
+          <w:rStyle w:val="VerbatimChar"/>
+        </w:rPr>
+        <w:t xml:space="preserve">git add .</w:t>
+      </w:r>
+      <w:r>
+        <w:br/>
+      </w:r>
+      <w:r>
+        <w:rPr>
+          <w:rStyle w:val="VerbatimChar"/>
+        </w:rPr>
+        <w:t xml:space="preserve">git commit -m "Initial commit: AI GTM Master Playbook install"</w:t>
+      </w:r>
+      <w:r>
+        <w:br/>
+      </w:r>
+      <w:r>
+        <w:rPr>
+          <w:rStyle w:val="VerbatimChar"/>
+        </w:rPr>
+        <w:t xml:space="preserve">gh repo create {brand-folder} --private --source=. --push</w:t>
+      </w:r>
+    </w:p>
+    <w:p>
+      <w:pPr>
+        <w:numPr>
+          <w:ilvl w:val="0"/>
+          <w:numId w:val="1000"/>
+        </w:numPr>
+      </w:pPr>
+      <w:r>
+        <w:t xml:space="preserve">Replace</w:t>
+      </w:r>
+      <w:r>
+        <w:t xml:space="preserve"> </w:t>
+      </w:r>
+      <w:r>
+        <w:rPr>
+          <w:rStyle w:val="VerbatimChar"/>
+        </w:rPr>
+        <w:t xml:space="preserve">{brand-folder}</w:t>
+      </w:r>
+      <w:r>
+        <w:t xml:space="preserve"> </w:t>
+      </w:r>
+      <w:r>
+        <w:t xml:space="preserve">with the current directory name. Confirm the repo exists at</w:t>
+      </w:r>
+      <w:r>
+        <w:t xml:space="preserve"> </w:t>
+      </w:r>
+      <w:r>
+        <w:rPr>
+          <w:rStyle w:val="VerbatimChar"/>
+        </w:rPr>
+        <w:t xml:space="preserve">github.com/{username}/{brand-folder}</w:t>
+      </w:r>
+      <w:r>
+        <w:t xml:space="preserve"> </w:t>
+      </w:r>
+      <w:r>
+        <w:t xml:space="preserve">and the initial commit landed.</w:t>
+      </w:r>
+    </w:p>
+    <w:p>
+      <w:pPr>
+        <w:numPr>
+          <w:ilvl w:val="0"/>
+          <w:numId w:val="1038"/>
+        </w:numPr>
+      </w:pPr>
+      <w:r>
+        <w:rPr>
+          <w:b/>
+          <w:bCs/>
+        </w:rPr>
+        <w:t xml:space="preserve">Fallback: no</w:t>
+      </w:r>
+      <w:r>
+        <w:rPr>
+          <w:b/>
+          <w:bCs/>
+        </w:rPr>
+        <w:t xml:space="preserve"> </w:t>
+      </w:r>
+      <w:r>
+        <w:rPr>
+          <w:rStyle w:val="VerbatimChar"/>
+          <w:b/>
+          <w:bCs/>
+        </w:rPr>
+        <w:t xml:space="preserve">gh</w:t>
+      </w:r>
+      <w:r>
+        <w:rPr>
+          <w:b/>
+          <w:bCs/>
+        </w:rPr>
+        <w:t xml:space="preserve"> </w:t>
+      </w:r>
+      <w:r>
+        <w:rPr>
+          <w:b/>
+          <w:bCs/>
+        </w:rPr>
+        <w:t xml:space="preserve">CLI available.</w:t>
+      </w:r>
+      <w:r>
+        <w:t xml:space="preserve"> </w:t>
+      </w:r>
+      <w:r>
+        <w:t xml:space="preserve">If the user can’t or won’t install</w:t>
+      </w:r>
+      <w:r>
+        <w:t xml:space="preserve"> </w:t>
+      </w:r>
+      <w:r>
+        <w:rPr>
+          <w:rStyle w:val="VerbatimChar"/>
+        </w:rPr>
+        <w:t xml:space="preserve">gh</w:t>
+      </w:r>
+      <w:r>
+        <w:t xml:space="preserve">, WebFetch current instructions for (a) creating a new repo via the GitHub web UI, (b) generating a Personal Access Token with</w:t>
+      </w:r>
+      <w:r>
+        <w:t xml:space="preserve"> </w:t>
+      </w:r>
+      <w:r>
+        <w:rPr>
+          <w:rStyle w:val="VerbatimChar"/>
+        </w:rPr>
+        <w:t xml:space="preserve">repo</w:t>
+      </w:r>
+      <w:r>
+        <w:t xml:space="preserve"> </w:t>
+      </w:r>
+      <w:r>
+        <w:t xml:space="preserve">scope, (c) adding the remote via</w:t>
+      </w:r>
+      <w:r>
+        <w:t xml:space="preserve"> </w:t>
+      </w:r>
+      <w:r>
+        <w:rPr>
+          <w:rStyle w:val="VerbatimChar"/>
+        </w:rPr>
+        <w:t xml:space="preserve">git remote add origin</w:t>
+      </w:r>
+      <w:r>
+        <w:t xml:space="preserve">, and (d) pushing with</w:t>
+      </w:r>
+      <w:r>
+        <w:t xml:space="preserve"> </w:t>
+      </w:r>
+      <w:r>
+        <w:rPr>
+          <w:rStyle w:val="VerbatimChar"/>
+        </w:rPr>
+        <w:t xml:space="preserve">git push -u origin main</w:t>
+      </w:r>
+      <w:r>
+        <w:t xml:space="preserve">. Walk them through each step and verify the push succeeds.</w:t>
+      </w:r>
+    </w:p>
+    <w:p>
+      <w:pPr>
+        <w:pStyle w:val="FirstParagraph"/>
+      </w:pPr>
+      <w:r>
+        <w:t xml:space="preserve">Confirm</w:t>
+      </w:r>
+      <w:r>
+        <w:t xml:space="preserve"> </w:t>
+      </w:r>
+      <w:r>
+        <w:rPr>
+          <w:rStyle w:val="VerbatimChar"/>
+        </w:rPr>
+        <w:t xml:space="preserve">git remote -v</w:t>
+      </w:r>
+      <w:r>
+        <w:t xml:space="preserve"> </w:t>
+      </w:r>
+      <w:r>
+        <w:t xml:space="preserve">now shows</w:t>
+      </w:r>
+      <w:r>
+        <w:t xml:space="preserve"> </w:t>
+      </w:r>
+      <w:r>
+        <w:rPr>
+          <w:rStyle w:val="VerbatimChar"/>
+        </w:rPr>
+        <w:t xml:space="preserve">origin</w:t>
+      </w:r>
+      <w:r>
+        <w:t xml:space="preserve"> </w:t>
+      </w:r>
+      <w:r>
+        <w:t xml:space="preserve">pointing to GitHub before proceeding to Step 4.</w:t>
       </w:r>
     </w:p>
     <w:p>
@@ -7053,7 +7527,8 @@
       </w:r>
     </w:p>
     <w:bookmarkEnd w:id="63"/>
-    <w:bookmarkStart w:id="64" w:name="step-4.-api-connection-verification"/>
+    <w:bookmarkEnd w:id="64"/>
+    <w:bookmarkStart w:id="65" w:name="step-4.-api-connection-verification"/>
     <w:p>
       <w:pPr>
         <w:pStyle w:val="Heading2"/>
@@ -7087,7 +7562,7 @@
         <w:pStyle w:val="Compact"/>
         <w:numPr>
           <w:ilvl w:val="0"/>
-          <w:numId w:val="1038"/>
+          <w:numId w:val="1039"/>
         </w:numPr>
       </w:pPr>
       <w:r>
@@ -7114,7 +7589,7 @@
         <w:pStyle w:val="Compact"/>
         <w:numPr>
           <w:ilvl w:val="0"/>
-          <w:numId w:val="1038"/>
+          <w:numId w:val="1039"/>
         </w:numPr>
       </w:pPr>
       <w:r>
@@ -7141,7 +7616,7 @@
         <w:pStyle w:val="Compact"/>
         <w:numPr>
           <w:ilvl w:val="0"/>
-          <w:numId w:val="1038"/>
+          <w:numId w:val="1039"/>
         </w:numPr>
       </w:pPr>
       <w:r>
@@ -7153,7 +7628,7 @@
         <w:pStyle w:val="Compact"/>
         <w:numPr>
           <w:ilvl w:val="0"/>
-          <w:numId w:val="1038"/>
+          <w:numId w:val="1039"/>
         </w:numPr>
       </w:pPr>
       <w:r>
@@ -7165,7 +7640,7 @@
         <w:pStyle w:val="Compact"/>
         <w:numPr>
           <w:ilvl w:val="0"/>
-          <w:numId w:val="1038"/>
+          <w:numId w:val="1039"/>
         </w:numPr>
       </w:pPr>
       <w:r>
@@ -7177,7 +7652,7 @@
         <w:pStyle w:val="Compact"/>
         <w:numPr>
           <w:ilvl w:val="0"/>
-          <w:numId w:val="1038"/>
+          <w:numId w:val="1039"/>
         </w:numPr>
       </w:pPr>
       <w:r>
@@ -7189,7 +7664,7 @@
         <w:pStyle w:val="Compact"/>
         <w:numPr>
           <w:ilvl w:val="0"/>
-          <w:numId w:val="1038"/>
+          <w:numId w:val="1039"/>
         </w:numPr>
       </w:pPr>
       <w:r>
@@ -7201,7 +7676,7 @@
         <w:pStyle w:val="Compact"/>
         <w:numPr>
           <w:ilvl w:val="0"/>
-          <w:numId w:val="1038"/>
+          <w:numId w:val="1039"/>
         </w:numPr>
       </w:pPr>
       <w:r>
@@ -7213,7 +7688,7 @@
         <w:pStyle w:val="Compact"/>
         <w:numPr>
           <w:ilvl w:val="0"/>
-          <w:numId w:val="1038"/>
+          <w:numId w:val="1039"/>
         </w:numPr>
       </w:pPr>
       <w:r>
@@ -7258,8 +7733,8 @@
         </w:pict>
       </w:r>
     </w:p>
-    <w:bookmarkEnd w:id="64"/>
-    <w:bookmarkStart w:id="65" w:name="Xff6fb944d9d69a804a78650e3d44c70f572f608"/>
+    <w:bookmarkEnd w:id="65"/>
+    <w:bookmarkStart w:id="66" w:name="Xff6fb944d9d69a804a78650e3d44c70f572f608"/>
     <w:p>
       <w:pPr>
         <w:pStyle w:val="Heading2"/>
@@ -7293,7 +7768,7 @@
         <w:pStyle w:val="Compact"/>
         <w:numPr>
           <w:ilvl w:val="0"/>
-          <w:numId w:val="1039"/>
+          <w:numId w:val="1040"/>
         </w:numPr>
       </w:pPr>
       <w:r>
@@ -7305,7 +7780,7 @@
         <w:pStyle w:val="Compact"/>
         <w:numPr>
           <w:ilvl w:val="0"/>
-          <w:numId w:val="1039"/>
+          <w:numId w:val="1040"/>
         </w:numPr>
       </w:pPr>
       <w:r>
@@ -7317,7 +7792,7 @@
         <w:pStyle w:val="Compact"/>
         <w:numPr>
           <w:ilvl w:val="0"/>
-          <w:numId w:val="1039"/>
+          <w:numId w:val="1040"/>
         </w:numPr>
       </w:pPr>
       <w:r>
@@ -7329,7 +7804,7 @@
         <w:pStyle w:val="Compact"/>
         <w:numPr>
           <w:ilvl w:val="0"/>
-          <w:numId w:val="1039"/>
+          <w:numId w:val="1040"/>
         </w:numPr>
       </w:pPr>
       <w:r>
@@ -7341,7 +7816,7 @@
         <w:pStyle w:val="Compact"/>
         <w:numPr>
           <w:ilvl w:val="0"/>
-          <w:numId w:val="1039"/>
+          <w:numId w:val="1040"/>
         </w:numPr>
       </w:pPr>
       <w:r>
@@ -7353,7 +7828,7 @@
         <w:pStyle w:val="Compact"/>
         <w:numPr>
           <w:ilvl w:val="0"/>
-          <w:numId w:val="1039"/>
+          <w:numId w:val="1040"/>
         </w:numPr>
       </w:pPr>
       <w:r>
@@ -7365,7 +7840,7 @@
         <w:pStyle w:val="Compact"/>
         <w:numPr>
           <w:ilvl w:val="0"/>
-          <w:numId w:val="1039"/>
+          <w:numId w:val="1040"/>
         </w:numPr>
       </w:pPr>
       <w:r>
@@ -7377,7 +7852,7 @@
         <w:pStyle w:val="Compact"/>
         <w:numPr>
           <w:ilvl w:val="0"/>
-          <w:numId w:val="1039"/>
+          <w:numId w:val="1040"/>
         </w:numPr>
       </w:pPr>
       <w:r>
@@ -7515,8 +7990,8 @@
         </w:pict>
       </w:r>
     </w:p>
-    <w:bookmarkEnd w:id="65"/>
-    <w:bookmarkStart w:id="75" w:name="step-6.-sub-playbook-installation"/>
+    <w:bookmarkEnd w:id="66"/>
+    <w:bookmarkStart w:id="76" w:name="step-6.-sub-playbook-installation"/>
     <w:p>
       <w:pPr>
         <w:pStyle w:val="Heading2"/>
@@ -7625,7 +8100,7 @@
         <w:t xml:space="preserve">The thirty-five sub-playbooks, grouped by function-area:</w:t>
       </w:r>
     </w:p>
-    <w:bookmarkStart w:id="66" w:name="paid-ads"/>
+    <w:bookmarkStart w:id="67" w:name="paid-ads"/>
     <w:p>
       <w:pPr>
         <w:pStyle w:val="Heading3"/>
@@ -7639,7 +8114,7 @@
         <w:pStyle w:val="Compact"/>
         <w:numPr>
           <w:ilvl w:val="0"/>
-          <w:numId w:val="1040"/>
+          <w:numId w:val="1041"/>
         </w:numPr>
       </w:pPr>
       <w:r>
@@ -7657,7 +8132,7 @@
         <w:pStyle w:val="Compact"/>
         <w:numPr>
           <w:ilvl w:val="0"/>
-          <w:numId w:val="1040"/>
+          <w:numId w:val="1041"/>
         </w:numPr>
       </w:pPr>
       <w:r>
@@ -7675,7 +8150,7 @@
         <w:pStyle w:val="Compact"/>
         <w:numPr>
           <w:ilvl w:val="0"/>
-          <w:numId w:val="1040"/>
+          <w:numId w:val="1041"/>
         </w:numPr>
       </w:pPr>
       <w:r>
@@ -7693,7 +8168,7 @@
         <w:pStyle w:val="Compact"/>
         <w:numPr>
           <w:ilvl w:val="0"/>
-          <w:numId w:val="1040"/>
+          <w:numId w:val="1041"/>
         </w:numPr>
       </w:pPr>
       <w:r>
@@ -7706,8 +8181,8 @@
         <w:t xml:space="preserve">: Competitor ads on Meta Ad Library, whitespace, angles to steal</w:t>
       </w:r>
     </w:p>
-    <w:bookmarkEnd w:id="66"/>
-    <w:bookmarkStart w:id="67" w:name="seo"/>
+    <w:bookmarkEnd w:id="67"/>
+    <w:bookmarkStart w:id="68" w:name="seo"/>
     <w:p>
       <w:pPr>
         <w:pStyle w:val="Heading3"/>
@@ -7721,7 +8196,7 @@
         <w:pStyle w:val="Compact"/>
         <w:numPr>
           <w:ilvl w:val="0"/>
-          <w:numId w:val="1041"/>
+          <w:numId w:val="1042"/>
         </w:numPr>
       </w:pPr>
       <w:r>
@@ -7739,7 +8214,7 @@
         <w:pStyle w:val="Compact"/>
         <w:numPr>
           <w:ilvl w:val="0"/>
-          <w:numId w:val="1041"/>
+          <w:numId w:val="1042"/>
         </w:numPr>
       </w:pPr>
       <w:r>
@@ -7757,7 +8232,7 @@
         <w:pStyle w:val="Compact"/>
         <w:numPr>
           <w:ilvl w:val="0"/>
-          <w:numId w:val="1041"/>
+          <w:numId w:val="1042"/>
         </w:numPr>
       </w:pPr>
       <w:r>
@@ -7775,7 +8250,7 @@
         <w:pStyle w:val="Compact"/>
         <w:numPr>
           <w:ilvl w:val="0"/>
-          <w:numId w:val="1041"/>
+          <w:numId w:val="1042"/>
         </w:numPr>
       </w:pPr>
       <w:r>
@@ -7793,7 +8268,7 @@
         <w:pStyle w:val="Compact"/>
         <w:numPr>
           <w:ilvl w:val="0"/>
-          <w:numId w:val="1041"/>
+          <w:numId w:val="1042"/>
         </w:numPr>
       </w:pPr>
       <w:r>
@@ -7806,8 +8281,8 @@
         <w:t xml:space="preserve">: URL structure, internal linking, topical clusters</w:t>
       </w:r>
     </w:p>
-    <w:bookmarkEnd w:id="67"/>
-    <w:bookmarkStart w:id="68" w:name="content"/>
+    <w:bookmarkEnd w:id="68"/>
+    <w:bookmarkStart w:id="69" w:name="content"/>
     <w:p>
       <w:pPr>
         <w:pStyle w:val="Heading3"/>
@@ -7821,7 +8296,7 @@
         <w:pStyle w:val="Compact"/>
         <w:numPr>
           <w:ilvl w:val="0"/>
-          <w:numId w:val="1042"/>
+          <w:numId w:val="1043"/>
         </w:numPr>
       </w:pPr>
       <w:r>
@@ -7839,7 +8314,7 @@
         <w:pStyle w:val="Compact"/>
         <w:numPr>
           <w:ilvl w:val="0"/>
-          <w:numId w:val="1042"/>
+          <w:numId w:val="1043"/>
         </w:numPr>
       </w:pPr>
       <w:r>
@@ -7857,7 +8332,7 @@
         <w:pStyle w:val="Compact"/>
         <w:numPr>
           <w:ilvl w:val="0"/>
-          <w:numId w:val="1042"/>
+          <w:numId w:val="1043"/>
         </w:numPr>
       </w:pPr>
       <w:r>
@@ -7875,7 +8350,7 @@
         <w:pStyle w:val="Compact"/>
         <w:numPr>
           <w:ilvl w:val="0"/>
-          <w:numId w:val="1042"/>
+          <w:numId w:val="1043"/>
         </w:numPr>
       </w:pPr>
       <w:r>
@@ -7893,7 +8368,7 @@
         <w:pStyle w:val="Compact"/>
         <w:numPr>
           <w:ilvl w:val="0"/>
-          <w:numId w:val="1042"/>
+          <w:numId w:val="1043"/>
         </w:numPr>
       </w:pPr>
       <w:r>
@@ -7906,8 +8381,8 @@
         <w:t xml:space="preserve">: Tighten existing copy, remove AI clichés</w:t>
       </w:r>
     </w:p>
-    <w:bookmarkEnd w:id="68"/>
-    <w:bookmarkStart w:id="69" w:name="influencer-and-pr"/>
+    <w:bookmarkEnd w:id="69"/>
+    <w:bookmarkStart w:id="70" w:name="influencer-and-pr"/>
     <w:p>
       <w:pPr>
         <w:pStyle w:val="Heading3"/>
@@ -7921,7 +8396,7 @@
         <w:pStyle w:val="Compact"/>
         <w:numPr>
           <w:ilvl w:val="0"/>
-          <w:numId w:val="1043"/>
+          <w:numId w:val="1044"/>
         </w:numPr>
       </w:pPr>
       <w:r>
@@ -7939,7 +8414,7 @@
         <w:pStyle w:val="Compact"/>
         <w:numPr>
           <w:ilvl w:val="0"/>
-          <w:numId w:val="1043"/>
+          <w:numId w:val="1044"/>
         </w:numPr>
       </w:pPr>
       <w:r>
@@ -7957,7 +8432,7 @@
         <w:pStyle w:val="Compact"/>
         <w:numPr>
           <w:ilvl w:val="0"/>
-          <w:numId w:val="1043"/>
+          <w:numId w:val="1044"/>
         </w:numPr>
       </w:pPr>
       <w:r>
@@ -7994,8 +8469,8 @@
         <w:t xml:space="preserve">pages</w:t>
       </w:r>
     </w:p>
-    <w:bookmarkEnd w:id="69"/>
-    <w:bookmarkStart w:id="70" w:name="cro"/>
+    <w:bookmarkEnd w:id="70"/>
+    <w:bookmarkStart w:id="71" w:name="cro"/>
     <w:p>
       <w:pPr>
         <w:pStyle w:val="Heading3"/>
@@ -8009,7 +8484,7 @@
         <w:pStyle w:val="Compact"/>
         <w:numPr>
           <w:ilvl w:val="0"/>
-          <w:numId w:val="1044"/>
+          <w:numId w:val="1045"/>
         </w:numPr>
       </w:pPr>
       <w:r>
@@ -8027,7 +8502,7 @@
         <w:pStyle w:val="Compact"/>
         <w:numPr>
           <w:ilvl w:val="0"/>
-          <w:numId w:val="1044"/>
+          <w:numId w:val="1045"/>
         </w:numPr>
       </w:pPr>
       <w:r>
@@ -8045,7 +8520,7 @@
         <w:pStyle w:val="Compact"/>
         <w:numPr>
           <w:ilvl w:val="0"/>
-          <w:numId w:val="1044"/>
+          <w:numId w:val="1045"/>
         </w:numPr>
       </w:pPr>
       <w:r>
@@ -8063,7 +8538,7 @@
         <w:pStyle w:val="Compact"/>
         <w:numPr>
           <w:ilvl w:val="0"/>
-          <w:numId w:val="1044"/>
+          <w:numId w:val="1045"/>
         </w:numPr>
       </w:pPr>
       <w:r>
@@ -8081,7 +8556,7 @@
         <w:pStyle w:val="Compact"/>
         <w:numPr>
           <w:ilvl w:val="0"/>
-          <w:numId w:val="1044"/>
+          <w:numId w:val="1045"/>
         </w:numPr>
       </w:pPr>
       <w:r>
@@ -8099,7 +8574,7 @@
         <w:pStyle w:val="Compact"/>
         <w:numPr>
           <w:ilvl w:val="0"/>
-          <w:numId w:val="1044"/>
+          <w:numId w:val="1045"/>
         </w:numPr>
       </w:pPr>
       <w:r>
@@ -8117,7 +8592,7 @@
         <w:pStyle w:val="Compact"/>
         <w:numPr>
           <w:ilvl w:val="0"/>
-          <w:numId w:val="1044"/>
+          <w:numId w:val="1045"/>
         </w:numPr>
       </w:pPr>
       <w:r>
@@ -8135,7 +8610,7 @@
         <w:pStyle w:val="Compact"/>
         <w:numPr>
           <w:ilvl w:val="0"/>
-          <w:numId w:val="1044"/>
+          <w:numId w:val="1045"/>
         </w:numPr>
       </w:pPr>
       <w:r>
@@ -8148,8 +8623,8 @@
         <w:t xml:space="preserve">: Weekly review of Clarity heatmaps and session recordings</w:t>
       </w:r>
     </w:p>
-    <w:bookmarkEnd w:id="70"/>
-    <w:bookmarkStart w:id="71" w:name="email-and-crm"/>
+    <w:bookmarkEnd w:id="71"/>
+    <w:bookmarkStart w:id="72" w:name="email-and-crm"/>
     <w:p>
       <w:pPr>
         <w:pStyle w:val="Heading3"/>
@@ -8163,7 +8638,7 @@
         <w:pStyle w:val="Compact"/>
         <w:numPr>
           <w:ilvl w:val="0"/>
-          <w:numId w:val="1045"/>
+          <w:numId w:val="1046"/>
         </w:numPr>
       </w:pPr>
       <w:r>
@@ -8181,7 +8656,7 @@
         <w:pStyle w:val="Compact"/>
         <w:numPr>
           <w:ilvl w:val="0"/>
-          <w:numId w:val="1045"/>
+          <w:numId w:val="1046"/>
         </w:numPr>
       </w:pPr>
       <w:r>
@@ -8199,7 +8674,7 @@
         <w:pStyle w:val="Compact"/>
         <w:numPr>
           <w:ilvl w:val="0"/>
-          <w:numId w:val="1045"/>
+          <w:numId w:val="1046"/>
         </w:numPr>
       </w:pPr>
       <w:r>
@@ -8212,8 +8687,8 @@
         <w:t xml:space="preserve">: Cancellation flows, save offers, dunning recovery</w:t>
       </w:r>
     </w:p>
-    <w:bookmarkEnd w:id="71"/>
-    <w:bookmarkStart w:id="72" w:name="creative"/>
+    <w:bookmarkEnd w:id="72"/>
+    <w:bookmarkStart w:id="73" w:name="creative"/>
     <w:p>
       <w:pPr>
         <w:pStyle w:val="Heading3"/>
@@ -8227,7 +8702,7 @@
         <w:pStyle w:val="Compact"/>
         <w:numPr>
           <w:ilvl w:val="0"/>
-          <w:numId w:val="1046"/>
+          <w:numId w:val="1047"/>
         </w:numPr>
       </w:pPr>
       <w:r>
@@ -8245,7 +8720,7 @@
         <w:pStyle w:val="Compact"/>
         <w:numPr>
           <w:ilvl w:val="0"/>
-          <w:numId w:val="1046"/>
+          <w:numId w:val="1047"/>
         </w:numPr>
       </w:pPr>
       <w:r>
@@ -8263,7 +8738,7 @@
         <w:pStyle w:val="Compact"/>
         <w:numPr>
           <w:ilvl w:val="0"/>
-          <w:numId w:val="1046"/>
+          <w:numId w:val="1047"/>
         </w:numPr>
       </w:pPr>
       <w:r>
@@ -8276,8 +8751,8 @@
         <w:t xml:space="preserve">: One blog post into 20+ platform-specific posts</w:t>
       </w:r>
     </w:p>
-    <w:bookmarkEnd w:id="72"/>
-    <w:bookmarkStart w:id="73" w:name="analytics-and-ops"/>
+    <w:bookmarkEnd w:id="73"/>
+    <w:bookmarkStart w:id="74" w:name="analytics-and-ops"/>
     <w:p>
       <w:pPr>
         <w:pStyle w:val="Heading3"/>
@@ -8291,7 +8766,7 @@
         <w:pStyle w:val="Compact"/>
         <w:numPr>
           <w:ilvl w:val="0"/>
-          <w:numId w:val="1047"/>
+          <w:numId w:val="1048"/>
         </w:numPr>
       </w:pPr>
       <w:r>
@@ -8309,7 +8784,7 @@
         <w:pStyle w:val="Compact"/>
         <w:numPr>
           <w:ilvl w:val="0"/>
-          <w:numId w:val="1047"/>
+          <w:numId w:val="1048"/>
         </w:numPr>
       </w:pPr>
       <w:r>
@@ -8327,7 +8802,7 @@
         <w:pStyle w:val="Compact"/>
         <w:numPr>
           <w:ilvl w:val="0"/>
-          <w:numId w:val="1047"/>
+          <w:numId w:val="1048"/>
         </w:numPr>
       </w:pPr>
       <w:r>
@@ -8340,8 +8815,8 @@
         <w:t xml:space="preserve">: Google Sheet refreshed every morning from every tool</w:t>
       </w:r>
     </w:p>
-    <w:bookmarkEnd w:id="73"/>
-    <w:bookmarkStart w:id="74" w:name="master-manager-flagship"/>
+    <w:bookmarkEnd w:id="74"/>
+    <w:bookmarkStart w:id="75" w:name="master-manager-flagship"/>
     <w:p>
       <w:pPr>
         <w:pStyle w:val="Heading3"/>
@@ -8355,7 +8830,7 @@
         <w:pStyle w:val="Compact"/>
         <w:numPr>
           <w:ilvl w:val="0"/>
-          <w:numId w:val="1048"/>
+          <w:numId w:val="1049"/>
         </w:numPr>
       </w:pPr>
       <w:r>
@@ -8533,9 +9008,9 @@
         </w:pict>
       </w:r>
     </w:p>
-    <w:bookmarkEnd w:id="74"/>
     <w:bookmarkEnd w:id="75"/>
-    <w:bookmarkStart w:id="76" w:name="X0c82461a68e99199111992dd9038425a047a139"/>
+    <w:bookmarkEnd w:id="76"/>
+    <w:bookmarkStart w:id="77" w:name="X0c82461a68e99199111992dd9038425a047a139"/>
     <w:p>
       <w:pPr>
         <w:pStyle w:val="Heading2"/>
@@ -8572,7 +9047,7 @@
         <w:pStyle w:val="Compact"/>
         <w:numPr>
           <w:ilvl w:val="0"/>
-          <w:numId w:val="1049"/>
+          <w:numId w:val="1050"/>
         </w:numPr>
       </w:pPr>
       <w:r>
@@ -8584,7 +9059,7 @@
         <w:pStyle w:val="Compact"/>
         <w:numPr>
           <w:ilvl w:val="0"/>
-          <w:numId w:val="1049"/>
+          <w:numId w:val="1050"/>
         </w:numPr>
       </w:pPr>
       <w:r>
@@ -8596,7 +9071,7 @@
         <w:pStyle w:val="Compact"/>
         <w:numPr>
           <w:ilvl w:val="0"/>
-          <w:numId w:val="1049"/>
+          <w:numId w:val="1050"/>
         </w:numPr>
       </w:pPr>
       <w:r>
@@ -8608,7 +9083,7 @@
         <w:pStyle w:val="Compact"/>
         <w:numPr>
           <w:ilvl w:val="0"/>
-          <w:numId w:val="1049"/>
+          <w:numId w:val="1050"/>
         </w:numPr>
       </w:pPr>
       <w:r>
@@ -8620,7 +9095,7 @@
         <w:pStyle w:val="Compact"/>
         <w:numPr>
           <w:ilvl w:val="0"/>
-          <w:numId w:val="1049"/>
+          <w:numId w:val="1050"/>
         </w:numPr>
       </w:pPr>
       <w:r>
@@ -8641,7 +9116,7 @@
         <w:pStyle w:val="Compact"/>
         <w:numPr>
           <w:ilvl w:val="0"/>
-          <w:numId w:val="1049"/>
+          <w:numId w:val="1050"/>
         </w:numPr>
       </w:pPr>
       <w:r>
@@ -8653,7 +9128,7 @@
         <w:pStyle w:val="Compact"/>
         <w:numPr>
           <w:ilvl w:val="0"/>
-          <w:numId w:val="1049"/>
+          <w:numId w:val="1050"/>
         </w:numPr>
       </w:pPr>
       <w:r>
@@ -8699,8 +9174,8 @@
         </w:pict>
       </w:r>
     </w:p>
-    <w:bookmarkEnd w:id="76"/>
-    <w:bookmarkStart w:id="77" w:name="step-8.-voice-enforcement-gate"/>
+    <w:bookmarkEnd w:id="77"/>
+    <w:bookmarkStart w:id="78" w:name="step-8.-voice-enforcement-gate"/>
     <w:p>
       <w:pPr>
         <w:pStyle w:val="Heading2"/>
@@ -9144,8 +9619,8 @@
         </w:pict>
       </w:r>
     </w:p>
-    <w:bookmarkEnd w:id="77"/>
-    <w:bookmarkStart w:id="78" w:name="step-9.-first-weekly-review-run"/>
+    <w:bookmarkEnd w:id="78"/>
+    <w:bookmarkStart w:id="79" w:name="step-9.-first-weekly-review-run"/>
     <w:p>
       <w:pPr>
         <w:pStyle w:val="Heading2"/>
@@ -9167,7 +9642,7 @@
         <w:pStyle w:val="Compact"/>
         <w:numPr>
           <w:ilvl w:val="0"/>
-          <w:numId w:val="1050"/>
+          <w:numId w:val="1051"/>
         </w:numPr>
       </w:pPr>
       <w:r>
@@ -9188,7 +9663,7 @@
         <w:pStyle w:val="Compact"/>
         <w:numPr>
           <w:ilvl w:val="0"/>
-          <w:numId w:val="1050"/>
+          <w:numId w:val="1051"/>
         </w:numPr>
       </w:pPr>
       <w:r>
@@ -9215,7 +9690,7 @@
         <w:pStyle w:val="Compact"/>
         <w:numPr>
           <w:ilvl w:val="0"/>
-          <w:numId w:val="1050"/>
+          <w:numId w:val="1051"/>
         </w:numPr>
       </w:pPr>
       <w:r>
@@ -9237,8 +9712,8 @@
         </w:pict>
       </w:r>
     </w:p>
-    <w:bookmarkEnd w:id="78"/>
-    <w:bookmarkStart w:id="79" w:name="Xe309785c3cdcb05e92489c55e6f2bd9b45a3161"/>
+    <w:bookmarkEnd w:id="79"/>
+    <w:bookmarkStart w:id="80" w:name="Xe309785c3cdcb05e92489c55e6f2bd9b45a3161"/>
     <w:p>
       <w:pPr>
         <w:pStyle w:val="Heading2"/>
@@ -9323,8 +9798,8 @@
         </w:pict>
       </w:r>
     </w:p>
-    <w:bookmarkEnd w:id="79"/>
-    <w:bookmarkStart w:id="80" w:name="Xeca2479b337d7d1fd5c99a168897a2be1cc83b5"/>
+    <w:bookmarkEnd w:id="80"/>
+    <w:bookmarkStart w:id="81" w:name="Xeca2479b337d7d1fd5c99a168897a2be1cc83b5"/>
     <w:p>
       <w:pPr>
         <w:pStyle w:val="Heading2"/>
@@ -9338,7 +9813,7 @@
         <w:pStyle w:val="Compact"/>
         <w:numPr>
           <w:ilvl w:val="0"/>
-          <w:numId w:val="1051"/>
+          <w:numId w:val="1052"/>
         </w:numPr>
       </w:pPr>
       <w:r>
@@ -9350,7 +9825,7 @@
         <w:pStyle w:val="Compact"/>
         <w:numPr>
           <w:ilvl w:val="0"/>
-          <w:numId w:val="1051"/>
+          <w:numId w:val="1052"/>
         </w:numPr>
       </w:pPr>
       <w:r>
@@ -9371,7 +9846,7 @@
         <w:pStyle w:val="Compact"/>
         <w:numPr>
           <w:ilvl w:val="0"/>
-          <w:numId w:val="1051"/>
+          <w:numId w:val="1052"/>
         </w:numPr>
       </w:pPr>
       <w:r>
@@ -9383,7 +9858,7 @@
         <w:pStyle w:val="Compact"/>
         <w:numPr>
           <w:ilvl w:val="0"/>
-          <w:numId w:val="1051"/>
+          <w:numId w:val="1052"/>
         </w:numPr>
       </w:pPr>
       <w:r>
@@ -9407,7 +9882,7 @@
         <w:pStyle w:val="Compact"/>
         <w:numPr>
           <w:ilvl w:val="0"/>
-          <w:numId w:val="1051"/>
+          <w:numId w:val="1052"/>
         </w:numPr>
       </w:pPr>
       <w:r>
@@ -9419,7 +9894,7 @@
         <w:pStyle w:val="Compact"/>
         <w:numPr>
           <w:ilvl w:val="0"/>
-          <w:numId w:val="1051"/>
+          <w:numId w:val="1052"/>
         </w:numPr>
       </w:pPr>
       <w:r>
@@ -9431,7 +9906,7 @@
         <w:pStyle w:val="Compact"/>
         <w:numPr>
           <w:ilvl w:val="0"/>
-          <w:numId w:val="1051"/>
+          <w:numId w:val="1052"/>
         </w:numPr>
       </w:pPr>
       <w:r>
@@ -9457,8 +9932,8 @@
         </w:pict>
       </w:r>
     </w:p>
-    <w:bookmarkEnd w:id="80"/>
-    <w:bookmarkStart w:id="81" w:name="acceptance-criteria"/>
+    <w:bookmarkEnd w:id="81"/>
+    <w:bookmarkStart w:id="82" w:name="acceptance-criteria"/>
     <w:p>
       <w:pPr>
         <w:pStyle w:val="Heading2"/>
@@ -9472,7 +9947,7 @@
         <w:pStyle w:val="Compact"/>
         <w:numPr>
           <w:ilvl w:val="0"/>
-          <w:numId w:val="1052"/>
+          <w:numId w:val="1053"/>
         </w:numPr>
       </w:pPr>
       <w:r>
@@ -9484,7 +9959,7 @@
         <w:pStyle w:val="Compact"/>
         <w:numPr>
           <w:ilvl w:val="0"/>
-          <w:numId w:val="1052"/>
+          <w:numId w:val="1053"/>
         </w:numPr>
       </w:pPr>
       <w:r>
@@ -9496,7 +9971,7 @@
         <w:pStyle w:val="Compact"/>
         <w:numPr>
           <w:ilvl w:val="0"/>
-          <w:numId w:val="1052"/>
+          <w:numId w:val="1053"/>
         </w:numPr>
       </w:pPr>
       <w:r>
@@ -9526,7 +10001,7 @@
         <w:pStyle w:val="Compact"/>
         <w:numPr>
           <w:ilvl w:val="0"/>
-          <w:numId w:val="1052"/>
+          <w:numId w:val="1053"/>
         </w:numPr>
       </w:pPr>
       <w:r>
@@ -9538,7 +10013,7 @@
         <w:pStyle w:val="Compact"/>
         <w:numPr>
           <w:ilvl w:val="0"/>
-          <w:numId w:val="1052"/>
+          <w:numId w:val="1053"/>
         </w:numPr>
       </w:pPr>
       <w:r>
@@ -9550,7 +10025,7 @@
         <w:pStyle w:val="Compact"/>
         <w:numPr>
           <w:ilvl w:val="0"/>
-          <w:numId w:val="1052"/>
+          <w:numId w:val="1053"/>
         </w:numPr>
       </w:pPr>
       <w:r>
@@ -9562,7 +10037,7 @@
         <w:pStyle w:val="Compact"/>
         <w:numPr>
           <w:ilvl w:val="0"/>
-          <w:numId w:val="1052"/>
+          <w:numId w:val="1053"/>
         </w:numPr>
       </w:pPr>
       <w:r>
@@ -9574,7 +10049,7 @@
         <w:pStyle w:val="Compact"/>
         <w:numPr>
           <w:ilvl w:val="0"/>
-          <w:numId w:val="1052"/>
+          <w:numId w:val="1053"/>
         </w:numPr>
       </w:pPr>
       <w:r>
@@ -9600,8 +10075,8 @@
         </w:pict>
       </w:r>
     </w:p>
-    <w:bookmarkEnd w:id="81"/>
-    <w:bookmarkStart w:id="82" w:name="what-to-do-with-the-operating-system"/>
+    <w:bookmarkEnd w:id="82"/>
+    <w:bookmarkStart w:id="83" w:name="what-to-do-with-the-operating-system"/>
     <w:p>
       <w:pPr>
         <w:pStyle w:val="Heading2"/>
@@ -9634,8 +10109,8 @@
         <w:t xml:space="preserve">Want this installed and run for you on a live engagement with a weekly review cadence, a daily dashboard, and the full set of thirty-five sub-playbooks already tuned for your category? Book a call at https://entirecommerce.ai/book-a-call.</w:t>
       </w:r>
     </w:p>
-    <w:bookmarkEnd w:id="82"/>
     <w:bookmarkEnd w:id="83"/>
+    <w:bookmarkEnd w:id="84"/>
     <w:sectPr>
       <w:footnotePr>
         <w:numRestart w:val="eachSect"/>
@@ -10913,12 +11388,6 @@
     </w:lvlOverride>
   </w:num>
   <w:num w:numId="1038">
-    <w:abstractNumId w:val="991"/>
-  </w:num>
-  <w:num w:numId="1039">
-    <w:abstractNumId w:val="991"/>
-  </w:num>
-  <w:num w:numId="1040">
     <w:abstractNumId w:val="99411"/>
     <w:lvlOverride w:ilvl="0">
       <w:startOverride w:val="1"/>
@@ -10948,7 +11417,43 @@
       <w:startOverride w:val="1"/>
     </w:lvlOverride>
   </w:num>
+  <w:num w:numId="1039">
+    <w:abstractNumId w:val="991"/>
+  </w:num>
+  <w:num w:numId="1040">
+    <w:abstractNumId w:val="991"/>
+  </w:num>
   <w:num w:numId="1041">
+    <w:abstractNumId w:val="99411"/>
+    <w:lvlOverride w:ilvl="0">
+      <w:startOverride w:val="1"/>
+    </w:lvlOverride>
+    <w:lvlOverride w:ilvl="1">
+      <w:startOverride w:val="1"/>
+    </w:lvlOverride>
+    <w:lvlOverride w:ilvl="2">
+      <w:startOverride w:val="1"/>
+    </w:lvlOverride>
+    <w:lvlOverride w:ilvl="3">
+      <w:startOverride w:val="1"/>
+    </w:lvlOverride>
+    <w:lvlOverride w:ilvl="4">
+      <w:startOverride w:val="1"/>
+    </w:lvlOverride>
+    <w:lvlOverride w:ilvl="5">
+      <w:startOverride w:val="1"/>
+    </w:lvlOverride>
+    <w:lvlOverride w:ilvl="6">
+      <w:startOverride w:val="1"/>
+    </w:lvlOverride>
+    <w:lvlOverride w:ilvl="7">
+      <w:startOverride w:val="1"/>
+    </w:lvlOverride>
+    <w:lvlOverride w:ilvl="8">
+      <w:startOverride w:val="1"/>
+    </w:lvlOverride>
+  </w:num>
+  <w:num w:numId="1042">
     <w:abstractNumId w:val="99415"/>
     <w:lvlOverride w:ilvl="0">
       <w:startOverride w:val="5"/>
@@ -10978,7 +11483,7 @@
       <w:startOverride w:val="5"/>
     </w:lvlOverride>
   </w:num>
-  <w:num w:numId="1042">
+  <w:num w:numId="1043">
     <w:abstractNumId w:val="994110"/>
     <w:lvlOverride w:ilvl="0">
       <w:startOverride w:val="10"/>
@@ -11008,7 +11513,7 @@
       <w:startOverride w:val="10"/>
     </w:lvlOverride>
   </w:num>
-  <w:num w:numId="1043">
+  <w:num w:numId="1044">
     <w:abstractNumId w:val="994115"/>
     <w:lvlOverride w:ilvl="0">
       <w:startOverride w:val="15"/>
@@ -11038,7 +11543,7 @@
       <w:startOverride w:val="15"/>
     </w:lvlOverride>
   </w:num>
-  <w:num w:numId="1044">
+  <w:num w:numId="1045">
     <w:abstractNumId w:val="994118"/>
     <w:lvlOverride w:ilvl="0">
       <w:startOverride w:val="18"/>
@@ -11068,7 +11573,7 @@
       <w:startOverride w:val="18"/>
     </w:lvlOverride>
   </w:num>
-  <w:num w:numId="1045">
+  <w:num w:numId="1046">
     <w:abstractNumId w:val="994126"/>
     <w:lvlOverride w:ilvl="0">
       <w:startOverride w:val="26"/>
@@ -11098,7 +11603,7 @@
       <w:startOverride w:val="26"/>
     </w:lvlOverride>
   </w:num>
-  <w:num w:numId="1046">
+  <w:num w:numId="1047">
     <w:abstractNumId w:val="994129"/>
     <w:lvlOverride w:ilvl="0">
       <w:startOverride w:val="29"/>
@@ -11128,7 +11633,7 @@
       <w:startOverride w:val="29"/>
     </w:lvlOverride>
   </w:num>
-  <w:num w:numId="1047">
+  <w:num w:numId="1048">
     <w:abstractNumId w:val="994132"/>
     <w:lvlOverride w:ilvl="0">
       <w:startOverride w:val="32"/>
@@ -11158,7 +11663,7 @@
       <w:startOverride w:val="32"/>
     </w:lvlOverride>
   </w:num>
-  <w:num w:numId="1048">
+  <w:num w:numId="1049">
     <w:abstractNumId w:val="994135"/>
     <w:lvlOverride w:ilvl="0">
       <w:startOverride w:val="35"/>
@@ -11188,9 +11693,6 @@
       <w:startOverride w:val="35"/>
     </w:lvlOverride>
   </w:num>
-  <w:num w:numId="1049">
-    <w:abstractNumId w:val="991"/>
-  </w:num>
   <w:num w:numId="1050">
     <w:abstractNumId w:val="991"/>
   </w:num>
@@ -11198,6 +11700,9 @@
     <w:abstractNumId w:val="991"/>
   </w:num>
   <w:num w:numId="1052">
+    <w:abstractNumId w:val="991"/>
+  </w:num>
+  <w:num w:numId="1053">
     <w:abstractNumId w:val="991"/>
   </w:num>
 </w:numbering>

</xml_diff>